<commit_message>
Improved on the README
</commit_message>
<xml_diff>
--- a/README.docx
+++ b/README.docx
@@ -19,7 +19,7 @@
           <w:sz w:val="40"/>
           <w:szCs w:val="40"/>
         </w:rPr>
-        <w:t>Embedded Morse CNN (STM32F429)</w:t>
+        <w:t>DSL Project</w:t>
       </w:r>
     </w:p>
     <w:p>
@@ -28,41 +28,57 @@
         <w:rPr>
           <w:b/>
           <w:bCs/>
-          <w:sz w:val="32"/>
-          <w:szCs w:val="32"/>
-        </w:rPr>
-      </w:pPr>
-      <w:r>
-        <w:rPr>
-          <w:b/>
-          <w:bCs/>
-          <w:sz w:val="32"/>
-          <w:szCs w:val="32"/>
-        </w:rPr>
-        <w:t>Performed By:</w:t>
+          <w:sz w:val="40"/>
+          <w:szCs w:val="40"/>
+        </w:rPr>
+      </w:pPr>
+      <w:proofErr w:type="spellStart"/>
+      <w:r>
+        <w:rPr>
+          <w:b/>
+          <w:bCs/>
+          <w:sz w:val="40"/>
+          <w:szCs w:val="40"/>
+        </w:rPr>
+        <w:t>MorseML</w:t>
+      </w:r>
+      <w:proofErr w:type="spellEnd"/>
+      <w:r>
+        <w:rPr>
+          <w:b/>
+          <w:bCs/>
+          <w:sz w:val="40"/>
+          <w:szCs w:val="40"/>
+        </w:rPr>
+        <w:t xml:space="preserve"> (STM32F429)</w:t>
       </w:r>
     </w:p>
     <w:p>
       <w:r>
         <w:pict w14:anchorId="0797FE98">
-          <v:rect id="_x0000_i1145" style="width:0;height:1.5pt" o:hralign="center" o:hrstd="t" o:hr="t" fillcolor="#a0a0a0" stroked="f"/>
+          <v:rect id="_x0000_i1025" style="width:0;height:1.5pt" o:hralign="center" o:hrstd="t" o:hr="t" fillcolor="#a0a0a0" stroked="f"/>
         </w:pict>
       </w:r>
     </w:p>
     <w:p>
-      <w:pPr>
-        <w:rPr>
-          <w:b/>
-          <w:bCs/>
-        </w:rPr>
-      </w:pPr>
-      <w:r>
-        <w:rPr>
-          <w:b/>
-          <w:bCs/>
-        </w:rPr>
-        <w:t>Overview</w:t>
-      </w:r>
+      <w:r>
+        <w:rPr>
+          <w:b/>
+          <w:bCs/>
+        </w:rPr>
+        <w:t>Basically</w:t>
+      </w:r>
+      <w:r>
+        <w:t>, this project listens to you if you talk to it in Morse code and subsequently decipher whatever you say! All you need is a Push Button (Blue Button on STM32 board).</w:t>
+      </w:r>
+    </w:p>
+    <w:p>
+      <w:pPr>
+        <w:rPr>
+          <w:b/>
+          <w:bCs/>
+        </w:rPr>
+      </w:pPr>
     </w:p>
     <w:p>
       <w:r>
@@ -110,7 +126,7 @@
     <w:p>
       <w:r>
         <w:pict w14:anchorId="6D0EB8D3">
-          <v:rect id="_x0000_i1146" style="width:0;height:1.5pt" o:hralign="center" o:hrstd="t" o:hr="t" fillcolor="#a0a0a0" stroked="f"/>
+          <v:rect id="_x0000_i1026" style="width:0;height:1.5pt" o:hralign="center" o:hrstd="t" o:hr="t" fillcolor="#a0a0a0" stroked="f"/>
         </w:pict>
       </w:r>
     </w:p>
@@ -186,7 +202,7 @@
     <w:p>
       <w:r>
         <w:pict w14:anchorId="68D56BEA">
-          <v:rect id="_x0000_i1147" style="width:0;height:1.5pt" o:hralign="center" o:hrstd="t" o:hr="t" fillcolor="#a0a0a0" stroked="f"/>
+          <v:rect id="_x0000_i1027" style="width:0;height:1.5pt" o:hralign="center" o:hrstd="t" o:hr="t" fillcolor="#a0a0a0" stroked="f"/>
         </w:pict>
       </w:r>
     </w:p>
@@ -503,7 +519,7 @@
     <w:p>
       <w:r>
         <w:pict w14:anchorId="5E99D42F">
-          <v:rect id="_x0000_i1148" style="width:0;height:1.5pt" o:hralign="center" o:hrstd="t" o:hr="t" fillcolor="#a0a0a0" stroked="f"/>
+          <v:rect id="_x0000_i1028" style="width:0;height:1.5pt" o:hralign="center" o:hrstd="t" o:hr="t" fillcolor="#a0a0a0" stroked="f"/>
         </w:pict>
       </w:r>
     </w:p>
@@ -524,6 +540,7 @@
     </w:p>
     <w:p>
       <w:r>
+        <w:lastRenderedPageBreak/>
         <w:t>The STM32 does not directly detect dots and dashes.</w:t>
       </w:r>
     </w:p>
@@ -540,7 +557,6 @@
         </w:numPr>
       </w:pPr>
       <w:r>
-        <w:lastRenderedPageBreak/>
         <w:t>Press duration → press[i]</w:t>
       </w:r>
     </w:p>
@@ -593,7 +609,7 @@
     <w:p>
       <w:r>
         <w:pict w14:anchorId="4E6E09A8">
-          <v:rect id="_x0000_i1149" style="width:0;height:1.5pt" o:hralign="center" o:hrstd="t" o:hr="t" fillcolor="#a0a0a0" stroked="f"/>
+          <v:rect id="_x0000_i1029" style="width:0;height:1.5pt" o:hralign="center" o:hrstd="t" o:hr="t" fillcolor="#a0a0a0" stroked="f"/>
         </w:pict>
       </w:r>
     </w:p>
@@ -657,7 +673,7 @@
     <w:p>
       <w:r>
         <w:pict w14:anchorId="6E755229">
-          <v:rect id="_x0000_i1150" style="width:0;height:1.5pt" o:hralign="center" o:hrstd="t" o:hr="t" fillcolor="#a0a0a0" stroked="f"/>
+          <v:rect id="_x0000_i1030" style="width:0;height:1.5pt" o:hralign="center" o:hrstd="t" o:hr="t" fillcolor="#a0a0a0" stroked="f"/>
         </w:pict>
       </w:r>
     </w:p>
@@ -724,7 +740,7 @@
     <w:p>
       <w:r>
         <w:pict w14:anchorId="25DDF0D2">
-          <v:rect id="_x0000_i1151" style="width:0;height:1.5pt" o:hralign="center" o:hrstd="t" o:hr="t" fillcolor="#a0a0a0" stroked="f"/>
+          <v:rect id="_x0000_i1031" style="width:0;height:1.5pt" o:hralign="center" o:hrstd="t" o:hr="t" fillcolor="#a0a0a0" stroked="f"/>
         </w:pict>
       </w:r>
     </w:p>
@@ -750,6 +766,7 @@
     </w:p>
     <w:p>
       <w:r>
+        <w:lastRenderedPageBreak/>
         <w:t>python dataset_generator.py</w:t>
       </w:r>
     </w:p>
@@ -766,7 +783,6 @@
         </w:numPr>
       </w:pPr>
       <w:r>
-        <w:lastRenderedPageBreak/>
         <w:t>Adds noise (±10ms)</w:t>
       </w:r>
     </w:p>
@@ -795,7 +811,7 @@
     <w:p>
       <w:r>
         <w:pict w14:anchorId="4E6C80EE">
-          <v:rect id="_x0000_i1152" style="width:0;height:1.5pt" o:hralign="center" o:hrstd="t" o:hr="t" fillcolor="#a0a0a0" stroked="f"/>
+          <v:rect id="_x0000_i1032" style="width:0;height:1.5pt" o:hralign="center" o:hrstd="t" o:hr="t" fillcolor="#a0a0a0" stroked="f"/>
         </w:pict>
       </w:r>
     </w:p>
@@ -832,7 +848,7 @@
     <w:p>
       <w:r>
         <w:pict w14:anchorId="339AFFBB">
-          <v:rect id="_x0000_i1153" style="width:0;height:1.5pt" o:hralign="center" o:hrstd="t" o:hr="t" fillcolor="#a0a0a0" stroked="f"/>
+          <v:rect id="_x0000_i1033" style="width:0;height:1.5pt" o:hralign="center" o:hrstd="t" o:hr="t" fillcolor="#a0a0a0" stroked="f"/>
         </w:pict>
       </w:r>
     </w:p>
@@ -884,7 +900,7 @@
     <w:p>
       <w:r>
         <w:pict w14:anchorId="5C517788">
-          <v:rect id="_x0000_i1154" style="width:0;height:1.5pt" o:hralign="center" o:hrstd="t" o:hr="t" fillcolor="#a0a0a0" stroked="f"/>
+          <v:rect id="_x0000_i1034" style="width:0;height:1.5pt" o:hralign="center" o:hrstd="t" o:hr="t" fillcolor="#a0a0a0" stroked="f"/>
         </w:pict>
       </w:r>
     </w:p>
@@ -992,7 +1008,7 @@
     <w:p>
       <w:r>
         <w:pict w14:anchorId="3C638B00">
-          <v:rect id="_x0000_i1155" style="width:0;height:1.5pt" o:hralign="center" o:hrstd="t" o:hr="t" fillcolor="#a0a0a0" stroked="f"/>
+          <v:rect id="_x0000_i1035" style="width:0;height:1.5pt" o:hralign="center" o:hrstd="t" o:hr="t" fillcolor="#a0a0a0" stroked="f"/>
         </w:pict>
       </w:r>
     </w:p>
@@ -1061,6 +1077,7 @@
         </w:numPr>
       </w:pPr>
       <w:r>
+        <w:lastRenderedPageBreak/>
         <w:t>Hard thresholds fail</w:t>
       </w:r>
     </w:p>
@@ -1087,7 +1104,6 @@
         </w:numPr>
       </w:pPr>
       <w:r>
-        <w:lastRenderedPageBreak/>
         <w:t>Learns patterns automatically</w:t>
       </w:r>
     </w:p>
@@ -1116,7 +1132,7 @@
     <w:p>
       <w:r>
         <w:pict w14:anchorId="51D85CBC">
-          <v:rect id="_x0000_i1156" style="width:0;height:1.5pt" o:hralign="center" o:hrstd="t" o:hr="t" fillcolor="#a0a0a0" stroked="f"/>
+          <v:rect id="_x0000_i1036" style="width:0;height:1.5pt" o:hralign="center" o:hrstd="t" o:hr="t" fillcolor="#a0a0a0" stroked="f"/>
         </w:pict>
       </w:r>
     </w:p>
@@ -1171,7 +1187,7 @@
     <w:p>
       <w:r>
         <w:pict w14:anchorId="746A7B0D">
-          <v:rect id="_x0000_i1157" style="width:0;height:1.5pt" o:hralign="center" o:hrstd="t" o:hr="t" fillcolor="#a0a0a0" stroked="f"/>
+          <v:rect id="_x0000_i1037" style="width:0;height:1.5pt" o:hralign="center" o:hrstd="t" o:hr="t" fillcolor="#a0a0a0" stroked="f"/>
         </w:pict>
       </w:r>
     </w:p>
@@ -1224,7 +1240,7 @@
     <w:p>
       <w:r>
         <w:pict w14:anchorId="33FF8AFF">
-          <v:rect id="_x0000_i1158" style="width:0;height:1.5pt" o:hralign="center" o:hrstd="t" o:hr="t" fillcolor="#a0a0a0" stroked="f"/>
+          <v:rect id="_x0000_i1038" style="width:0;height:1.5pt" o:hralign="center" o:hrstd="t" o:hr="t" fillcolor="#a0a0a0" stroked="f"/>
         </w:pict>
       </w:r>
     </w:p>
@@ -1277,7 +1293,7 @@
     <w:p>
       <w:r>
         <w:pict w14:anchorId="6D843A6A">
-          <v:rect id="_x0000_i1159" style="width:0;height:1.5pt" o:hralign="center" o:hrstd="t" o:hr="t" fillcolor="#a0a0a0" stroked="f"/>
+          <v:rect id="_x0000_i1039" style="width:0;height:1.5pt" o:hralign="center" o:hrstd="t" o:hr="t" fillcolor="#a0a0a0" stroked="f"/>
         </w:pict>
       </w:r>
     </w:p>
@@ -1314,7 +1330,7 @@
     <w:p>
       <w:r>
         <w:pict w14:anchorId="04C1F64A">
-          <v:rect id="_x0000_i1160" style="width:0;height:1.5pt" o:hralign="center" o:hrstd="t" o:hr="t" fillcolor="#a0a0a0" stroked="f"/>
+          <v:rect id="_x0000_i1040" style="width:0;height:1.5pt" o:hralign="center" o:hrstd="t" o:hr="t" fillcolor="#a0a0a0" stroked="f"/>
         </w:pict>
       </w:r>
     </w:p>
@@ -1391,7 +1407,7 @@
     <w:p>
       <w:r>
         <w:pict w14:anchorId="20121913">
-          <v:rect id="_x0000_i1161" style="width:0;height:1.5pt" o:hralign="center" o:hrstd="t" o:hr="t" fillcolor="#a0a0a0" stroked="f"/>
+          <v:rect id="_x0000_i1041" style="width:0;height:1.5pt" o:hralign="center" o:hrstd="t" o:hr="t" fillcolor="#a0a0a0" stroked="f"/>
         </w:pict>
       </w:r>
     </w:p>
@@ -1407,6 +1423,7 @@
           <w:b/>
           <w:bCs/>
         </w:rPr>
+        <w:lastRenderedPageBreak/>
         <w:t>PuTTY Configuration</w:t>
       </w:r>
     </w:p>
@@ -1429,7 +1446,6 @@
         </w:numPr>
       </w:pPr>
       <w:r>
-        <w:lastRenderedPageBreak/>
         <w:t>Data Bits: 8</w:t>
       </w:r>
     </w:p>
@@ -1447,7 +1463,7 @@
     <w:p>
       <w:r>
         <w:pict w14:anchorId="7158BD79">
-          <v:rect id="_x0000_i1162" style="width:0;height:1.5pt" o:hralign="center" o:hrstd="t" o:hr="t" fillcolor="#a0a0a0" stroked="f"/>
+          <v:rect id="_x0000_i1042" style="width:0;height:1.5pt" o:hralign="center" o:hrstd="t" o:hr="t" fillcolor="#a0a0a0" stroked="f"/>
         </w:pict>
       </w:r>
     </w:p>
@@ -1489,7 +1505,7 @@
     <w:p>
       <w:r>
         <w:pict w14:anchorId="7469C769">
-          <v:rect id="_x0000_i1163" style="width:0;height:1.5pt" o:hralign="center" o:hrstd="t" o:hr="t" fillcolor="#a0a0a0" stroked="f"/>
+          <v:rect id="_x0000_i1043" style="width:0;height:1.5pt" o:hralign="center" o:hrstd="t" o:hr="t" fillcolor="#a0a0a0" stroked="f"/>
         </w:pict>
       </w:r>
     </w:p>
@@ -1574,7 +1590,7 @@
     <w:p>
       <w:r>
         <w:pict w14:anchorId="1913FC1C">
-          <v:rect id="_x0000_i1164" style="width:0;height:1.5pt" o:hralign="center" o:hrstd="t" o:hr="t" fillcolor="#a0a0a0" stroked="f"/>
+          <v:rect id="_x0000_i1044" style="width:0;height:1.5pt" o:hralign="center" o:hrstd="t" o:hr="t" fillcolor="#a0a0a0" stroked="f"/>
         </w:pict>
       </w:r>
     </w:p>
@@ -4446,6 +4462,7 @@
   <w:style w:type="character" w:default="1" w:styleId="DefaultParagraphFont">
     <w:name w:val="Default Paragraph Font"/>
     <w:uiPriority w:val="1"/>
+    <w:semiHidden/>
     <w:unhideWhenUsed/>
   </w:style>
   <w:style w:type="table" w:default="1" w:styleId="TableNormal">

</xml_diff>